<commit_message>
docs: alinea el guion del video 2 del modulo 1 con el mazo y lo humaniza
</commit_message>
<xml_diff>
--- a/docs/capacitacion/guion youtube/modulo-1-el-problema-y-las-bases/video-2-inteligencia-artificial-entrenamiento-y-neurona/modulo-1-video-2-inteligencia-artificial-entrenamiento-y-neurona-natural.docx
+++ b/docs/capacitacion/guion youtube/modulo-1-el-problema-y-las-bases/video-2-inteligencia-artificial-entrenamiento-y-neurona/modulo-1-video-2-inteligencia-artificial-entrenamiento-y-neurona-natural.docx
@@ -48,7 +48,7 @@
     </w:p>
     <w:p>
       <w:r>
-        <w:t>Escriben un mensaje en el teléfono y les sugiere la siguiente palabra. ¿Qué está pasando ahí? Un modelo aprendió, de millones de textos, qué palabras suelen seguir a cuáles. El correo manda un mensaje a la carpeta de no deseados: otro modelo se formó con muchísimos correos que otras personas marcaron como basura, y así reconoce los rasgos de ese tipo de mensaje. Y la plataforma de video propone qué ver después porque se apoya en lo que miraron personas parecidas a ustedes.</w:t>
+        <w:t>Escriben un mensaje en el teléfono y les sugiere la siguiente palabra. ¿Qué está pasando ahí? Un modelo aprendió, de millones de textos, qué palabras suelen seguir a cuáles. El correo manda un mensaje a la carpeta de no deseados: otro modelo se formó con muchísimos correos que otras personas marcaron como basura, y así reconoce los rasgos de ese tipo de mensaje. Y la plataforma de video propone qué ver después porque se apoya en lo que miraron personas parecidas a ustedes. La voz y la traducción aprendieron de grabaciones transcritas y de textos traducidos. Y la cámara del teléfono agrupa fotos por personas y enfoca caras gracias a muchísimos ejemplos.</w:t>
       </w:r>
     </w:p>
     <w:p>
@@ -100,6 +100,11 @@
     <w:p>
       <w:r>
         <w:t>Tercero: medir. Una vez localizada una estructura, se puede obtener su tamaño, su forma o su intensidad. Con las mediciones de cientos de estructuras se pueden comparar condiciones y tratamientos.</w:t>
+      </w:r>
+    </w:p>
+    <w:p>
+      <w:r>
+        <w:t>Hay otras dos tareas que se ven seguido: clasificar, que es decidir de qué tipo es una célula, y filtrar, que es señalar qué imágenes merecen atención antes de revisarlas una por una.</w:t>
       </w:r>
     </w:p>
     <w:p>
@@ -181,7 +186,7 @@
           <w:i/>
           <w:sz w:val="20"/>
         </w:rPr>
-        <w:t>Idea central: Seis palabras para los cuatro módulos: red neuronal, Google Colab, Python, Flask, modelo y servidor. Entrenamiento e inferencia se explican en las siguientes diapositivas.</w:t>
+        <w:t>Idea central: Ocho palabras para los cuatro módulos: red neuronal, Google Colab, Python, Flask, modelo, servidor, entrenamiento e inferencia. Entrenamiento e inferencia se explican en las diapositivas 7 a 9.</w:t>
       </w:r>
     </w:p>
     <w:p>
@@ -237,7 +242,7 @@
     </w:p>
     <w:p>
       <w:r>
-        <w:t>Una cosa más. Hay redes de muchos tamaños. Algunas tienen unas decenas de pesos y se pueden estudiar a mano. Las que se usan con imágenes tienen millones, y la que usamos nosotros tiene decenas de millones. Pero el principio es siempre el mismo: operaciones pequeñas, con pesos ajustables, que se ajustan con ejemplos.</w:t>
+        <w:t>Hay redes de muchos tamaños. Algunas tienen unas decenas de pesos y se pueden estudiar a mano. Las que se usan con imágenes tienen millones, y la que usamos nosotros tiene decenas de millones. Pero el principio es siempre el mismo: operaciones pequeñas, con pesos ajustables, que se ajustan con ejemplos.</w:t>
       </w:r>
     </w:p>
     <w:p>
@@ -365,6 +370,11 @@
     </w:p>
     <w:p>
       <w:r>
+        <w:t>Entrenar es costoso: pide muchos cálculos y una máquina con tarjeta gráfica, y puede tardar de minutos a horas. Por eso se hace una vez, y se repite solo si hay una razón.</w:t>
+      </w:r>
+    </w:p>
+    <w:p>
+      <w:r>
         <w:rPr>
           <w:b/>
           <w:color w:val="1F4E9A"/>
@@ -396,7 +406,7 @@
     </w:p>
     <w:p>
       <w:r>
-        <w:t>Eso la hace mucho más liviana que el entrenamiento: una pasada hacia adelante cuesta una fracción de una pasada completa con ajuste, y por eso alcanza con el procesador del servidor.</w:t>
+        <w:t>Eso la hace mucho más liviana que el entrenamiento: una pasada hacia adelante cuesta una fracción de una pasada completa con ajuste, y por eso alcanza con el procesador del servidor. Y se usa cada vez que alguien entra al sitio con una imagen, mientras que el entrenamiento se hace una vez, o muy pocas.</w:t>
       </w:r>
     </w:p>
     <w:p>
@@ -432,7 +442,7 @@
     </w:p>
     <w:p>
       <w:r>
-        <w:t>La primera idea es usar el brillo. Los espermatozoides son brillantes sobre fondo oscuro. Entonces se podría decir: todo píxel con un brillo mayor a cierto valor pertenece a una célula. Luego se agrupan los píxeles vecinos en manchas, y cada mancha es una célula. Esa técnica se llama umbralización, y el sitio la incluye como respaldo.</w:t>
+        <w:t>La primera idea es usar el brillo. Los espermatozoides son brillantes sobre fondo oscuro. Entonces se podría decir: todo píxel con un brillo mayor a cierto valor pertenece a una célula. Luego se agrupan los píxeles vecinos en manchas, y cada mancha es una célula. Esa técnica se llama umbralización, y el sitio la incluye como respaldo. En la foto de la derecha se ve un ejemplo en una imagen cualquiera: lo que supera el umbral queda en blanco, y lo demás en negro.</w:t>
       </w:r>
     </w:p>
     <w:p>
@@ -503,11 +513,6 @@
     </w:p>
     <w:p>
       <w:r>
-        <w:t>Pensarlo así nos quita el misterio: una red neuronal es una máquina de reconocer patrones, muy buena, que hay que usar con criterio.</w:t>
-      </w:r>
-    </w:p>
-    <w:p>
-      <w:r>
         <w:rPr>
           <w:b/>
           <w:color w:val="1F4E9A"/>
@@ -539,7 +544,12 @@
     </w:p>
     <w:p>
       <w:r>
-        <w:t>El cambio de fondo es de método: en lugar de decirle a la computadora cómo hacer algo, le mostramos qué queremos y dejamos que descubra cómo.</w:t>
+        <w:t>Cuando el umbral falla, la solución es agregar otra regla, y cada regla nueva arriesga a las demás. Cuando la red falla, se agregan ejemplos y se entrena de nuevo. A cambio, la red cuesta más: necesita ejemplos anotados y entrenamiento, y sus decisiones son más difíciles de explicar. El umbral casi no cuesta nada.</w:t>
+      </w:r>
+    </w:p>
+    <w:p>
+      <w:r>
+        <w:t>El cambio de fondo es de método: en lugar de decirle a la computadora cómo hacer algo, le mostramos qué queremos y dejamos que descubra cómo. Y recordemos el reparto: la red localiza y el código mide.</w:t>
       </w:r>
     </w:p>
     <w:p>
@@ -570,7 +580,7 @@
     </w:p>
     <w:p>
       <w:r>
-        <w:t>Uno: recibe una lista de números, que son las entradas. Dos: cada entrada se multiplica por otro número, que es su peso. Tres: se suman los resultados. Cuatro: a esa suma se le aplica una pequeña función que decide cuándo se activa la neurona.</w:t>
+        <w:t>Uno: recibe una lista de números, que son las entradas. Dos: cada entrada se multiplica por otro número, que es su peso. Tres: se suman los resultados. Cuatro: a esa suma se le aplica una pequeña función que decide cuándo se activa la neurona. Eso mismo es lo que muestra el diagrama de la derecha, con sus nombres en inglés: inputs son las entradas, weights los pesos, la sigma es la suma y la letra fi es la activación. El umbral que aparece ahí abajo es lo que aquí llamamos sesgo, y lo vemos enseguida.</w:t>
       </w:r>
     </w:p>
     <w:p>
@@ -585,7 +595,7 @@
     </w:p>
     <w:p>
       <w:r>
-        <w:t>El último paso es la función de activación, que es lo que hace posible que las redes sean tan potentes. Por ahora basta saber que es una regla sencilla: si la suma es negativa, la salida es cero, y si es positiva, pasa tal cual.</w:t>
+        <w:t>El último paso es la función de activación. Por ahora basta saber que es una regla sencilla: si la suma es negativa, la salida es cero, y si es positiva, pasa tal cual.</w:t>
       </w:r>
     </w:p>
     <w:p>
@@ -600,7 +610,7 @@
     </w:p>
     <w:p>
       <w:r>
-        <w:t>Sin que nadie le dijera la palabra rojo, esta neurona distingue un píxel rojo de uno azul, solo por cómo están puestos sus pesos. El sesgo también cuenta: si fuera menos uno en lugar de menos cero punto tres, el píxel naranja daría solo cerca de cero punto veinticuatro, una respuesta mucho más tímida.</w:t>
+        <w:t>Sin que nadie le dijera la palabra rojo, esta neurona distingue un píxel rojo de uno azul, solo por cómo están puestos sus pesos. Con un píxel azul, de veinte, treinta y doscientos veinte, el total sale negativo, menos uno punto doce, y la neurona se apaga: responde cero. El sesgo también cuenta: si fuera menos uno en lugar de menos cero punto tres, el píxel naranja daría solo cerca de cero punto veinticuatro, una respuesta mucho más tímida.</w:t>
       </w:r>
     </w:p>
     <w:p>
@@ -692,7 +702,7 @@
     </w:p>
     <w:p>
       <w:r>
-        <w:t>En una gráfica es una línea plana en cero hasta el origen, y luego una línea que sube en diagonal. Esa pequeña esquina es lo que hace posible que las redes sean tan potentes. Con ella, cada neurona tiene un comportamiento de encendido y apagado: no responde nada hasta que el estímulo supera cierto nivel, y a partir de ahí responde de forma proporcional.</w:t>
+        <w:t>En una gráfica es una línea plana en cero hasta el origen, y luego una línea que sube en diagonal. Sin esa pequeña esquina, apilar capas no serviría de nada. Con ella, cada neurona tiene un comportamiento de encendido y apagado: no responde nada hasta que el estímulo supera cierto nivel, y a partir de ahí responde de forma proporcional.</w:t>
       </w:r>
     </w:p>
     <w:p>

</xml_diff>